<commit_message>
Update the Flower School page with the new workshop text and Red Lion Christmas wreath classes.
Co-authored-by: Cursor <cursoragent@cursor.com>
</commit_message>
<xml_diff>
--- a/NEW WEBSITE TEXT.docx
+++ b/NEW WEBSITE TEXT.docx
@@ -1,6 +1,6 @@
 
 <file path=word/document.xml><?xml version="1.0" encoding="utf-8"?>
-<w:document xmlns:wpc="http://schemas.microsoft.com/office/word/2010/wordprocessingCanvas" xmlns:cx="http://schemas.microsoft.com/office/drawing/2014/chartex" xmlns:cx1="http://schemas.microsoft.com/office/drawing/2015/9/8/chartex" xmlns:cx2="http://schemas.microsoft.com/office/drawing/2015/10/21/chartex" xmlns:cx3="http://schemas.microsoft.com/office/drawing/2016/5/9/chartex" xmlns:cx4="http://schemas.microsoft.com/office/drawing/2016/5/10/chartex" xmlns:cx5="http://schemas.microsoft.com/office/drawing/2016/5/11/chartex" xmlns:cx6="http://schemas.microsoft.com/office/drawing/2016/5/12/chartex" xmlns:cx7="http://schemas.microsoft.com/office/drawing/2016/5/13/chartex" xmlns:cx8="http://schemas.microsoft.com/office/drawing/2016/5/14/chartex" xmlns:mc="http://schemas.openxmlformats.org/markup-compatibility/2006" xmlns:aink="http://schemas.microsoft.com/office/drawing/2016/ink" xmlns:am3d="http://schemas.microsoft.com/office/drawing/2017/model3d" xmlns:o="urn:schemas-microsoft-com:office:office" xmlns:oel="http://schemas.microsoft.com/office/2019/extlst" xmlns:r="http://schemas.openxmlformats.org/officeDocument/2006/relationships" xmlns:m="http://schemas.openxmlformats.org/officeDocument/2006/math" xmlns:v="urn:schemas-microsoft-com:vml" xmlns:wp14="http://schemas.microsoft.com/office/word/2010/wordprocessingDrawing" xmlns:wp="http://schemas.openxmlformats.org/drawingml/2006/wordprocessingDrawing" xmlns:w10="urn:schemas-microsoft-com:office:word" xmlns:w="http://schemas.openxmlformats.org/wordprocessingml/2006/main" xmlns:w14="http://schemas.microsoft.com/office/word/2010/wordml" xmlns:w15="http://schemas.microsoft.com/office/word/2012/wordml" xmlns:w16cex="http://schemas.microsoft.com/office/word/2018/wordml/cex" xmlns:w16cid="http://schemas.microsoft.com/office/word/2016/wordml/cid" xmlns:w16="http://schemas.microsoft.com/office/word/2018/wordml" xmlns:w16du="http://schemas.microsoft.com/office/word/2023/wordml/word16du" xmlns:w16sdtdh="http://schemas.microsoft.com/office/word/2020/wordml/sdtdatahash" xmlns:w16sdtfl="http://schemas.microsoft.com/office/word/2024/wordml/sdtformatlock" xmlns:w16se="http://schemas.microsoft.com/office/word/2015/wordml/symex" xmlns:wpg="http://schemas.microsoft.com/office/word/2010/wordprocessingGroup" xmlns:wpi="http://schemas.microsoft.com/office/word/2010/wordprocessingInk" xmlns:wne="http://schemas.microsoft.com/office/word/2006/wordml" xmlns:wps="http://schemas.microsoft.com/office/word/2010/wordprocessingShape" mc:Ignorable="w14 w15 w16se w16cid w16 w16cex w16sdtdh w16sdtfl w16du wp14">
+<w:document xmlns:wpc="http://schemas.microsoft.com/office/word/2010/wordprocessingCanvas" xmlns:cx="http://schemas.microsoft.com/office/drawing/2014/chartex" xmlns:cx1="http://schemas.microsoft.com/office/drawing/2015/9/8/chartex" xmlns:cx2="http://schemas.microsoft.com/office/drawing/2015/10/21/chartex" xmlns:cx3="http://schemas.microsoft.com/office/drawing/2016/5/9/chartex" xmlns:cx4="http://schemas.microsoft.com/office/drawing/2016/5/10/chartex" xmlns:cx5="http://schemas.microsoft.com/office/drawing/2016/5/11/chartex" xmlns:cx6="http://schemas.microsoft.com/office/drawing/2016/5/12/chartex" xmlns:cx7="http://schemas.microsoft.com/office/drawing/2016/5/13/chartex" xmlns:cx8="http://schemas.microsoft.com/office/drawing/2016/5/14/chartex" xmlns:mc="http://schemas.openxmlformats.org/markup-compatibility/2006" xmlns:m="http://schemas.openxmlformats.org/officeDocument/2006/math" xmlns:aink="http://schemas.microsoft.com/office/drawing/2016/ink" xmlns:am3d="http://schemas.microsoft.com/office/drawing/2017/model3d" xmlns:oel="http://schemas.microsoft.com/office/2019/extlst" xmlns:r="http://schemas.openxmlformats.org/officeDocument/2006/relationships" xmlns:wp14="http://schemas.microsoft.com/office/word/2010/wordprocessingDrawing" xmlns:wp="http://schemas.openxmlformats.org/drawingml/2006/wordprocessingDrawing" xmlns:wpg="http://schemas.microsoft.com/office/word/2010/wordprocessingGroup" xmlns:wpi="http://schemas.microsoft.com/office/word/2010/wordprocessingInk" xmlns:wps="http://schemas.microsoft.com/office/word/2010/wordprocessingShape" xmlns:o="urn:schemas-microsoft-com:office:office" xmlns:v="urn:schemas-microsoft-com:vml" xmlns:w10="urn:schemas-microsoft-com:office:word" xmlns:w="http://schemas.openxmlformats.org/wordprocessingml/2006/main" xmlns:w14="http://schemas.microsoft.com/office/word/2010/wordml" xmlns:w15="http://schemas.microsoft.com/office/word/2012/wordml" xmlns:w16cex="http://schemas.microsoft.com/office/word/2018/wordml/cex" xmlns:w16cid="http://schemas.microsoft.com/office/word/2016/wordml/cid" xmlns:w16="http://schemas.microsoft.com/office/word/2018/wordml" xmlns:w16sdtdh="http://schemas.microsoft.com/office/word/2020/wordml/sdtdatahash" xmlns:w16sdtfl="http://schemas.microsoft.com/office/word/2024/wordml/sdtformatlock" xmlns:w16se="http://schemas.microsoft.com/office/word/2015/wordml/symex" xmlns:w16du="http://schemas.microsoft.com/office/word/2023/wordml/word16du" xmlns:wne="http://schemas.microsoft.com/office/word/2006/wordml" mc:Ignorable="w14 w15 w16se w16cid w16 w16cex w16sdtdh w16sdtfl w16du wp14">
   <w:body>
     <w:p>
       <w:pPr>
@@ -2389,6 +2389,93 @@
     <w:p>
       <w:pPr>
         <w:pStyle w:val="NormalWeb"/>
+        <w:spacing w:before="0" w:beforeAutospacing="0" w:after="264" w:afterAutospacing="0"/>
+        <w:rPr>
+          <w:rFonts w:asciiTheme="minorHAnsi" w:hAnsiTheme="minorHAnsi" w:cstheme="minorHAnsi"/>
+          <w:color w:val="000000" w:themeColor="text1"/>
+        </w:rPr>
+      </w:pPr>
+      <w:r>
+        <w:rPr>
+          <w:rFonts w:asciiTheme="minorHAnsi" w:hAnsiTheme="minorHAnsi" w:cstheme="minorHAnsi"/>
+          <w:color w:val="000000" w:themeColor="text1"/>
+        </w:rPr>
+        <w:t xml:space="preserve">Run by </w:t>
+      </w:r>
+      <w:r>
+        <w:rPr>
+          <w:rFonts w:asciiTheme="minorHAnsi" w:hAnsiTheme="minorHAnsi" w:cstheme="minorHAnsi"/>
+          <w:color w:val="000000" w:themeColor="text1"/>
+        </w:rPr>
+        <w:t xml:space="preserve">our </w:t>
+      </w:r>
+      <w:r>
+        <w:rPr>
+          <w:rFonts w:asciiTheme="minorHAnsi" w:hAnsiTheme="minorHAnsi" w:cstheme="minorHAnsi"/>
+          <w:color w:val="000000" w:themeColor="text1"/>
+        </w:rPr>
+        <w:t>award-winning florist</w:t>
+      </w:r>
+      <w:r>
+        <w:rPr>
+          <w:rFonts w:asciiTheme="minorHAnsi" w:hAnsiTheme="minorHAnsi" w:cstheme="minorHAnsi"/>
+          <w:color w:val="000000" w:themeColor="text1"/>
+        </w:rPr>
+        <w:t>s</w:t>
+      </w:r>
+      <w:r>
+        <w:rPr>
+          <w:rFonts w:asciiTheme="minorHAnsi" w:hAnsiTheme="minorHAnsi" w:cstheme="minorHAnsi"/>
+          <w:color w:val="000000" w:themeColor="text1"/>
+        </w:rPr>
+        <w:t xml:space="preserve">, </w:t>
+      </w:r>
+      <w:r>
+        <w:rPr>
+          <w:rFonts w:asciiTheme="minorHAnsi" w:hAnsiTheme="minorHAnsi" w:cstheme="minorHAnsi"/>
+          <w:color w:val="000000" w:themeColor="text1"/>
+        </w:rPr>
+        <w:t>Lucy and Frankie</w:t>
+      </w:r>
+      <w:r>
+        <w:rPr>
+          <w:rFonts w:asciiTheme="minorHAnsi" w:hAnsiTheme="minorHAnsi" w:cstheme="minorHAnsi"/>
+          <w:color w:val="000000" w:themeColor="text1"/>
+        </w:rPr>
+        <w:t xml:space="preserve">, </w:t>
+      </w:r>
+      <w:r>
+        <w:rPr>
+          <w:rFonts w:asciiTheme="minorHAnsi" w:hAnsiTheme="minorHAnsi" w:cstheme="minorHAnsi"/>
+          <w:color w:val="000000" w:themeColor="text1"/>
+        </w:rPr>
+        <w:t xml:space="preserve">we offer a range of wonderful flowery classes, that make the perfect activity, ideal for </w:t>
+      </w:r>
+      <w:r>
+        <w:rPr>
+          <w:rFonts w:asciiTheme="minorHAnsi" w:hAnsiTheme="minorHAnsi" w:cstheme="minorHAnsi"/>
+          <w:color w:val="000000" w:themeColor="text1"/>
+        </w:rPr>
+        <w:t>groups looking for a unique and private celebration such as a baby shower</w:t>
+      </w:r>
+      <w:r>
+        <w:rPr>
+          <w:rFonts w:asciiTheme="minorHAnsi" w:hAnsiTheme="minorHAnsi" w:cstheme="minorHAnsi"/>
+          <w:color w:val="000000" w:themeColor="text1"/>
+        </w:rPr>
+        <w:t>, Christmas party</w:t>
+      </w:r>
+      <w:r>
+        <w:rPr>
+          <w:rFonts w:asciiTheme="minorHAnsi" w:hAnsiTheme="minorHAnsi" w:cstheme="minorHAnsi"/>
+          <w:color w:val="000000" w:themeColor="text1"/>
+        </w:rPr>
+        <w:t xml:space="preserve">, hen party or birthday. They are an equally popular choice for corporate entertainment and hospitality showcases too. We can tailor our workshop format to create a bespoke floral experience you'll never forget. </w:t>
+      </w:r>
+    </w:p>
+    <w:p>
+      <w:pPr>
+        <w:pStyle w:val="NormalWeb"/>
         <w:spacing w:before="0" w:beforeAutospacing="0" w:after="0" w:afterAutospacing="0"/>
         <w:rPr>
           <w:rFonts w:asciiTheme="minorHAnsi" w:hAnsiTheme="minorHAnsi" w:cstheme="minorHAnsi"/>
@@ -2400,77 +2487,8 @@
           <w:rFonts w:asciiTheme="minorHAnsi" w:hAnsiTheme="minorHAnsi" w:cstheme="minorHAnsi"/>
           <w:color w:val="000000" w:themeColor="text1"/>
         </w:rPr>
-        <w:t xml:space="preserve">Run by </w:t>
-      </w:r>
-      <w:r>
-        <w:rPr>
-          <w:rFonts w:asciiTheme="minorHAnsi" w:hAnsiTheme="minorHAnsi" w:cstheme="minorHAnsi"/>
-          <w:color w:val="000000" w:themeColor="text1"/>
-        </w:rPr>
-        <w:t xml:space="preserve">our </w:t>
-      </w:r>
-      <w:r>
-        <w:rPr>
-          <w:rFonts w:asciiTheme="minorHAnsi" w:hAnsiTheme="minorHAnsi" w:cstheme="minorHAnsi"/>
-          <w:color w:val="000000" w:themeColor="text1"/>
-        </w:rPr>
-        <w:t>award-winning florist</w:t>
-      </w:r>
-      <w:r>
-        <w:rPr>
-          <w:rFonts w:asciiTheme="minorHAnsi" w:hAnsiTheme="minorHAnsi" w:cstheme="minorHAnsi"/>
-          <w:color w:val="000000" w:themeColor="text1"/>
-        </w:rPr>
-        <w:t>s</w:t>
-      </w:r>
-      <w:r>
-        <w:rPr>
-          <w:rFonts w:asciiTheme="minorHAnsi" w:hAnsiTheme="minorHAnsi" w:cstheme="minorHAnsi"/>
-          <w:color w:val="000000" w:themeColor="text1"/>
-        </w:rPr>
-        <w:t xml:space="preserve">, </w:t>
-      </w:r>
-      <w:r>
-        <w:rPr>
-          <w:rFonts w:asciiTheme="minorHAnsi" w:hAnsiTheme="minorHAnsi" w:cstheme="minorHAnsi"/>
-          <w:color w:val="000000" w:themeColor="text1"/>
-        </w:rPr>
-        <w:t>Lucy and Frankie</w:t>
-      </w:r>
-      <w:r>
-        <w:rPr>
-          <w:rFonts w:asciiTheme="minorHAnsi" w:hAnsiTheme="minorHAnsi" w:cstheme="minorHAnsi"/>
-          <w:color w:val="000000" w:themeColor="text1"/>
-        </w:rPr>
-        <w:t xml:space="preserve">, each </w:t>
-      </w:r>
-      <w:r>
-        <w:rPr>
-          <w:rFonts w:asciiTheme="minorHAnsi" w:hAnsiTheme="minorHAnsi" w:cstheme="minorHAnsi"/>
-          <w:color w:val="000000" w:themeColor="text1"/>
-        </w:rPr>
-        <w:t xml:space="preserve">of our </w:t>
-      </w:r>
-      <w:r>
-        <w:rPr>
-          <w:rFonts w:asciiTheme="minorHAnsi" w:hAnsiTheme="minorHAnsi" w:cstheme="minorHAnsi"/>
-          <w:color w:val="000000" w:themeColor="text1"/>
-        </w:rPr>
-        <w:t xml:space="preserve">two-hour workshop starts with </w:t>
-      </w:r>
-      <w:r>
-        <w:rPr>
-          <w:rFonts w:asciiTheme="minorHAnsi" w:hAnsiTheme="minorHAnsi" w:cstheme="minorHAnsi"/>
-          <w:color w:val="000000" w:themeColor="text1"/>
-        </w:rPr>
-        <w:t>a glass of bubbles or a G&amp;T and a</w:t>
-      </w:r>
-      <w:r>
-        <w:rPr>
-          <w:rFonts w:asciiTheme="minorHAnsi" w:hAnsiTheme="minorHAnsi" w:cstheme="minorHAnsi"/>
-          <w:color w:val="000000" w:themeColor="text1"/>
-        </w:rPr>
-        <w:t xml:space="preserve"> demonstration on how to choose, prepare, wire and arrange your flowers into a beautiful bespoke arrangement. With an assortment of fabulous flowers</w:t>
+        <w:lastRenderedPageBreak/>
+        <w:t>With an assortment of fabulous flowers</w:t>
       </w:r>
       <w:r>
         <w:rPr>
@@ -2593,89 +2611,6 @@
           <w:color w:val="000000" w:themeColor="text1"/>
         </w:rPr>
         <w:t xml:space="preserve"> you may need for your design.</w:t>
-      </w:r>
-    </w:p>
-    <w:p>
-      <w:pPr>
-        <w:pStyle w:val="NormalWeb"/>
-        <w:spacing w:before="0" w:beforeAutospacing="0" w:after="264" w:afterAutospacing="0"/>
-        <w:rPr>
-          <w:rFonts w:asciiTheme="minorHAnsi" w:hAnsiTheme="minorHAnsi" w:cstheme="minorHAnsi"/>
-          <w:color w:val="000000" w:themeColor="text1"/>
-        </w:rPr>
-      </w:pPr>
-      <w:r>
-        <w:rPr>
-          <w:rFonts w:asciiTheme="minorHAnsi" w:hAnsiTheme="minorHAnsi" w:cstheme="minorHAnsi"/>
-          <w:color w:val="000000" w:themeColor="text1"/>
-        </w:rPr>
-        <w:t>We also offer bespoke workshops for groups looking for a unique and private celebration such as a baby shower</w:t>
-      </w:r>
-      <w:r>
-        <w:rPr>
-          <w:rFonts w:asciiTheme="minorHAnsi" w:hAnsiTheme="minorHAnsi" w:cstheme="minorHAnsi"/>
-          <w:color w:val="000000" w:themeColor="text1"/>
-        </w:rPr>
-        <w:t>, Christmas party</w:t>
-      </w:r>
-      <w:r>
-        <w:rPr>
-          <w:rFonts w:asciiTheme="minorHAnsi" w:hAnsiTheme="minorHAnsi" w:cstheme="minorHAnsi"/>
-          <w:color w:val="000000" w:themeColor="text1"/>
-        </w:rPr>
-        <w:t xml:space="preserve">, hen party or birthday. They are an equally popular choice for corporate entertainment and hospitality showcases too. We can tailor our workshop format to create a bespoke floral experience you'll never forget. </w:t>
-      </w:r>
-    </w:p>
-    <w:p>
-      <w:pPr>
-        <w:pStyle w:val="NormalWeb"/>
-        <w:spacing w:before="0" w:beforeAutospacing="0" w:after="264" w:afterAutospacing="0"/>
-        <w:rPr>
-          <w:rFonts w:asciiTheme="minorHAnsi" w:hAnsiTheme="minorHAnsi" w:cstheme="minorHAnsi"/>
-          <w:color w:val="000000" w:themeColor="text1"/>
-        </w:rPr>
-      </w:pPr>
-      <w:r>
-        <w:rPr>
-          <w:rFonts w:asciiTheme="minorHAnsi" w:hAnsiTheme="minorHAnsi" w:cstheme="minorHAnsi"/>
-          <w:color w:val="000000" w:themeColor="text1"/>
-        </w:rPr>
-        <w:t>V</w:t>
-      </w:r>
-      <w:r>
-        <w:rPr>
-          <w:rFonts w:asciiTheme="minorHAnsi" w:hAnsiTheme="minorHAnsi" w:cstheme="minorHAnsi"/>
-          <w:color w:val="000000" w:themeColor="text1"/>
-        </w:rPr>
-        <w:t>ouchers</w:t>
-      </w:r>
-      <w:r>
-        <w:rPr>
-          <w:rFonts w:asciiTheme="minorHAnsi" w:hAnsiTheme="minorHAnsi" w:cstheme="minorHAnsi"/>
-          <w:color w:val="000000" w:themeColor="text1"/>
-        </w:rPr>
-        <w:t xml:space="preserve"> for classes</w:t>
-      </w:r>
-      <w:r>
-        <w:rPr>
-          <w:rFonts w:asciiTheme="minorHAnsi" w:hAnsiTheme="minorHAnsi" w:cstheme="minorHAnsi"/>
-          <w:color w:val="000000" w:themeColor="text1"/>
-        </w:rPr>
-        <w:t xml:space="preserve"> are also available</w:t>
-      </w:r>
-      <w:r>
-        <w:rPr>
-          <w:rFonts w:asciiTheme="minorHAnsi" w:hAnsiTheme="minorHAnsi" w:cstheme="minorHAnsi"/>
-          <w:color w:val="000000" w:themeColor="text1"/>
-        </w:rPr>
-        <w:t xml:space="preserve"> to give as a gift</w:t>
-      </w:r>
-      <w:r>
-        <w:rPr>
-          <w:rFonts w:asciiTheme="minorHAnsi" w:hAnsiTheme="minorHAnsi" w:cstheme="minorHAnsi"/>
-          <w:color w:val="000000" w:themeColor="text1"/>
-        </w:rPr>
-        <w:t>.</w:t>
       </w:r>
     </w:p>
     <w:p>
@@ -2910,47 +2845,6 @@
           <w:rFonts w:asciiTheme="minorHAnsi" w:hAnsiTheme="minorHAnsi" w:cstheme="minorHAnsi"/>
           <w:color w:val="000000" w:themeColor="text1"/>
         </w:rPr>
-        <w:t>Classes in 202</w:t>
-      </w:r>
-      <w:r>
-        <w:rPr>
-          <w:rFonts w:asciiTheme="minorHAnsi" w:hAnsiTheme="minorHAnsi" w:cstheme="minorHAnsi"/>
-          <w:color w:val="000000" w:themeColor="text1"/>
-        </w:rPr>
-        <w:t>4</w:t>
-      </w:r>
-    </w:p>
-    <w:p>
-      <w:pPr>
-        <w:pStyle w:val="NormalWeb"/>
-        <w:spacing w:before="0" w:beforeAutospacing="0" w:after="264" w:afterAutospacing="0"/>
-        <w:rPr>
-          <w:rFonts w:asciiTheme="minorHAnsi" w:hAnsiTheme="minorHAnsi" w:cstheme="minorHAnsi"/>
-          <w:color w:val="000000" w:themeColor="text1"/>
-        </w:rPr>
-      </w:pPr>
-      <w:r>
-        <w:rPr>
-          <w:rFonts w:asciiTheme="minorHAnsi" w:hAnsiTheme="minorHAnsi" w:cstheme="minorHAnsi"/>
-          <w:color w:val="000000" w:themeColor="text1"/>
-        </w:rPr>
-        <w:t>Please see below for all the class dates released at this current time. All classes are subject to availability.</w:t>
-      </w:r>
-    </w:p>
-    <w:p>
-      <w:pPr>
-        <w:pStyle w:val="NormalWeb"/>
-        <w:spacing w:before="0" w:beforeAutospacing="0" w:after="264" w:afterAutospacing="0"/>
-        <w:rPr>
-          <w:rFonts w:asciiTheme="minorHAnsi" w:hAnsiTheme="minorHAnsi" w:cstheme="minorHAnsi"/>
-          <w:color w:val="000000" w:themeColor="text1"/>
-        </w:rPr>
-      </w:pPr>
-      <w:r>
-        <w:rPr>
-          <w:rFonts w:asciiTheme="minorHAnsi" w:hAnsiTheme="minorHAnsi" w:cstheme="minorHAnsi"/>
-          <w:color w:val="000000" w:themeColor="text1"/>
-        </w:rPr>
         <w:t xml:space="preserve">Christmas Wreath Classes </w:t>
       </w:r>
       <w:r>
@@ -2962,232 +2856,180 @@
       </w:r>
     </w:p>
     <w:p>
-      <w:r>
-        <w:t>It’s that time of year again!! Our ever-popular Christmas wreath classes are back, and we can’t wait to see you all! £</w:t>
+      <w:pPr>
+        <w:tabs>
+          <w:tab w:val="left" w:pos="560"/>
+          <w:tab w:val="left" w:pos="1120"/>
+          <w:tab w:val="left" w:pos="1680"/>
+          <w:tab w:val="left" w:pos="2240"/>
+          <w:tab w:val="left" w:pos="2800"/>
+          <w:tab w:val="left" w:pos="3360"/>
+          <w:tab w:val="left" w:pos="3920"/>
+          <w:tab w:val="left" w:pos="4480"/>
+          <w:tab w:val="left" w:pos="5040"/>
+          <w:tab w:val="left" w:pos="5600"/>
+          <w:tab w:val="left" w:pos="6160"/>
+          <w:tab w:val="left" w:pos="6720"/>
+        </w:tabs>
+        <w:autoSpaceDE w:val="0"/>
+        <w:autoSpaceDN w:val="0"/>
+        <w:adjustRightInd w:val="0"/>
+        <w:rPr>
+          <w:rFonts w:ascii="Helvetica" w:hAnsi="Helvetica" w:cs="Helvetica"/>
+          <w:kern w:val="0"/>
+        </w:rPr>
+      </w:pPr>
+      <w:r>
+        <w:rPr>
+          <w:rFonts w:ascii="Helvetica" w:hAnsi="Helvetica" w:cs="Helvetica"/>
+          <w:kern w:val="0"/>
+        </w:rPr>
+        <w:t>Our Christmas Wreath Classes have had an upgrade this year!</w:t>
+      </w:r>
+    </w:p>
+    <w:p>
+      <w:pPr>
+        <w:tabs>
+          <w:tab w:val="left" w:pos="560"/>
+          <w:tab w:val="left" w:pos="1120"/>
+          <w:tab w:val="left" w:pos="1680"/>
+          <w:tab w:val="left" w:pos="2240"/>
+          <w:tab w:val="left" w:pos="2800"/>
+          <w:tab w:val="left" w:pos="3360"/>
+          <w:tab w:val="left" w:pos="3920"/>
+          <w:tab w:val="left" w:pos="4480"/>
+          <w:tab w:val="left" w:pos="5040"/>
+          <w:tab w:val="left" w:pos="5600"/>
+          <w:tab w:val="left" w:pos="6160"/>
+          <w:tab w:val="left" w:pos="6720"/>
+        </w:tabs>
+        <w:autoSpaceDE w:val="0"/>
+        <w:autoSpaceDN w:val="0"/>
+        <w:adjustRightInd w:val="0"/>
+        <w:rPr>
+          <w:rFonts w:ascii="Helvetica" w:hAnsi="Helvetica" w:cs="Helvetica"/>
+          <w:kern w:val="0"/>
+        </w:rPr>
+      </w:pPr>
+      <w:r>
+        <w:rPr>
+          <w:rFonts w:ascii="Helvetica" w:hAnsi="Helvetica" w:cs="Helvetica"/>
+          <w:kern w:val="0"/>
+        </w:rPr>
+        <w:t>Join us once again for our fabulous wreath making classes! This year, we are mixing things up-instead of you joining us in the shop, we will be joining forces with the Red Lion Pub in Histon for a couple evenings of festive fun! With the bar ready to serve you all the refreshments you could possibly want, we will teach you to create your own</w:t>
+      </w:r>
+    </w:p>
+    <w:p>
+      <w:pPr>
+        <w:tabs>
+          <w:tab w:val="left" w:pos="560"/>
+          <w:tab w:val="left" w:pos="1120"/>
+          <w:tab w:val="left" w:pos="1680"/>
+          <w:tab w:val="left" w:pos="2240"/>
+          <w:tab w:val="left" w:pos="2800"/>
+          <w:tab w:val="left" w:pos="3360"/>
+          <w:tab w:val="left" w:pos="3920"/>
+          <w:tab w:val="left" w:pos="4480"/>
+          <w:tab w:val="left" w:pos="5040"/>
+          <w:tab w:val="left" w:pos="5600"/>
+          <w:tab w:val="left" w:pos="6160"/>
+          <w:tab w:val="left" w:pos="6720"/>
+        </w:tabs>
+        <w:autoSpaceDE w:val="0"/>
+        <w:autoSpaceDN w:val="0"/>
+        <w:adjustRightInd w:val="0"/>
+        <w:rPr>
+          <w:rFonts w:ascii="Helvetica" w:hAnsi="Helvetica" w:cs="Helvetica"/>
+          <w:kern w:val="0"/>
+        </w:rPr>
+      </w:pPr>
+      <w:r>
+        <w:rPr>
+          <w:rFonts w:ascii="Helvetica" w:hAnsi="Helvetica" w:cs="Helvetica"/>
+          <w:kern w:val="0"/>
+        </w:rPr>
+        <w:t>fully moss-backed spruce wreath!</w:t>
+      </w:r>
+    </w:p>
+    <w:p>
+      <w:pPr>
+        <w:tabs>
+          <w:tab w:val="left" w:pos="560"/>
+          <w:tab w:val="left" w:pos="1120"/>
+          <w:tab w:val="left" w:pos="1680"/>
+          <w:tab w:val="left" w:pos="2240"/>
+          <w:tab w:val="left" w:pos="2800"/>
+          <w:tab w:val="left" w:pos="3360"/>
+          <w:tab w:val="left" w:pos="3920"/>
+          <w:tab w:val="left" w:pos="4480"/>
+          <w:tab w:val="left" w:pos="5040"/>
+          <w:tab w:val="left" w:pos="5600"/>
+          <w:tab w:val="left" w:pos="6160"/>
+          <w:tab w:val="left" w:pos="6720"/>
+        </w:tabs>
+        <w:autoSpaceDE w:val="0"/>
+        <w:autoSpaceDN w:val="0"/>
+        <w:adjustRightInd w:val="0"/>
+        <w:rPr>
+          <w:rFonts w:ascii="Helvetica" w:hAnsi="Helvetica" w:cs="Helvetica"/>
+          <w:kern w:val="0"/>
+        </w:rPr>
+      </w:pPr>
+      <w:r>
+        <w:rPr>
+          <w:rFonts w:ascii="Helvetica" w:hAnsi="Helvetica" w:cs="Helvetica"/>
+          <w:kern w:val="0"/>
+        </w:rPr>
+        <w:t>To book your spot call</w:t>
+      </w:r>
+    </w:p>
+    <w:p>
+      <w:r>
+        <w:rPr>
+          <w:rFonts w:ascii="Helvetica" w:hAnsi="Helvetica" w:cs="Helvetica"/>
+          <w:kern w:val="0"/>
+        </w:rPr>
+        <w:t>01223 656670, pop in, or email info@ginhouseflowers.co.uk</w:t>
+      </w:r>
+      <w:r>
+        <w:t>£</w:t>
       </w:r>
       <w:r>
         <w:t>6</w:t>
       </w:r>
       <w:r>
-        <w:t xml:space="preserve">0 per person and as usual, we will provide you with G&amp;Ts / enough bubbly to sink a small ship and plenty of snacks to keep you going, as well as </w:t>
-      </w:r>
-      <w:r>
-        <w:lastRenderedPageBreak/>
-        <w:t xml:space="preserve">everything you need to create your very own, fully moss backed spruce wreath! Secure your spot by dropping us a message, email or pop into the shop (£10 deposit per person) and let us know if your group requires a private date and we will see what we can do! We can’t wait to see what beauties you make with us this year! </w:t>
-      </w:r>
-    </w:p>
-    <w:p>
-      <w:pPr>
-        <w:pStyle w:val="NormalWeb"/>
-        <w:spacing w:before="0" w:beforeAutospacing="0" w:after="264" w:afterAutospacing="0"/>
-        <w:rPr>
-          <w:rFonts w:asciiTheme="minorHAnsi" w:hAnsiTheme="minorHAnsi" w:cstheme="minorHAnsi"/>
-          <w:color w:val="000000" w:themeColor="text1"/>
-        </w:rPr>
-      </w:pPr>
-    </w:p>
-    <w:p>
-      <w:pPr>
-        <w:pStyle w:val="NormalWeb"/>
-        <w:spacing w:before="0" w:beforeAutospacing="0" w:after="264" w:afterAutospacing="0"/>
-        <w:rPr>
-          <w:rFonts w:asciiTheme="minorHAnsi" w:hAnsiTheme="minorHAnsi" w:cstheme="minorHAnsi"/>
-          <w:color w:val="000000" w:themeColor="text1"/>
-        </w:rPr>
-      </w:pPr>
-      <w:r>
-        <w:rPr>
-          <w:rFonts w:asciiTheme="minorHAnsi" w:hAnsiTheme="minorHAnsi" w:cstheme="minorHAnsi"/>
-          <w:color w:val="000000" w:themeColor="text1"/>
-        </w:rPr>
-        <w:t>28.11.24 7pm</w:t>
-      </w:r>
-    </w:p>
-    <w:p>
-      <w:pPr>
-        <w:pStyle w:val="NormalWeb"/>
-        <w:spacing w:before="0" w:beforeAutospacing="0" w:after="264" w:afterAutospacing="0"/>
-        <w:rPr>
-          <w:rFonts w:asciiTheme="minorHAnsi" w:hAnsiTheme="minorHAnsi" w:cstheme="minorHAnsi"/>
-          <w:color w:val="000000" w:themeColor="text1"/>
-        </w:rPr>
-      </w:pPr>
-      <w:r>
-        <w:rPr>
-          <w:rFonts w:asciiTheme="minorHAnsi" w:hAnsiTheme="minorHAnsi" w:cstheme="minorHAnsi"/>
-          <w:color w:val="000000" w:themeColor="text1"/>
-        </w:rPr>
-        <w:t>29.11.24 7pm</w:t>
-      </w:r>
-    </w:p>
-    <w:p>
-      <w:pPr>
-        <w:pStyle w:val="NormalWeb"/>
-        <w:spacing w:before="0" w:beforeAutospacing="0" w:after="264" w:afterAutospacing="0"/>
-        <w:rPr>
-          <w:rFonts w:asciiTheme="minorHAnsi" w:hAnsiTheme="minorHAnsi" w:cstheme="minorHAnsi"/>
-          <w:color w:val="000000" w:themeColor="text1"/>
-        </w:rPr>
-      </w:pPr>
-      <w:r>
-        <w:rPr>
-          <w:rFonts w:asciiTheme="minorHAnsi" w:hAnsiTheme="minorHAnsi" w:cstheme="minorHAnsi"/>
-          <w:color w:val="000000" w:themeColor="text1"/>
-        </w:rPr>
-        <w:t>30.11.24 2pm</w:t>
-      </w:r>
-    </w:p>
-    <w:p>
-      <w:pPr>
-        <w:pStyle w:val="NormalWeb"/>
-        <w:spacing w:before="0" w:beforeAutospacing="0" w:after="264" w:afterAutospacing="0"/>
-        <w:rPr>
-          <w:rFonts w:asciiTheme="minorHAnsi" w:hAnsiTheme="minorHAnsi" w:cstheme="minorHAnsi"/>
-          <w:color w:val="000000" w:themeColor="text1"/>
-        </w:rPr>
-      </w:pPr>
-      <w:r>
-        <w:rPr>
-          <w:rFonts w:asciiTheme="minorHAnsi" w:hAnsiTheme="minorHAnsi" w:cstheme="minorHAnsi"/>
-          <w:color w:val="000000" w:themeColor="text1"/>
-        </w:rPr>
-        <w:t>3.12.24 7pm</w:t>
-      </w:r>
-    </w:p>
-    <w:p>
-      <w:pPr>
-        <w:pStyle w:val="NormalWeb"/>
-        <w:spacing w:before="0" w:beforeAutospacing="0" w:after="264" w:afterAutospacing="0"/>
-        <w:rPr>
-          <w:rFonts w:asciiTheme="minorHAnsi" w:hAnsiTheme="minorHAnsi" w:cstheme="minorHAnsi"/>
-          <w:color w:val="000000" w:themeColor="text1"/>
-        </w:rPr>
-      </w:pPr>
-      <w:r>
-        <w:rPr>
-          <w:rFonts w:asciiTheme="minorHAnsi" w:hAnsiTheme="minorHAnsi" w:cstheme="minorHAnsi"/>
-          <w:color w:val="000000" w:themeColor="text1"/>
-        </w:rPr>
-        <w:t>4.12.24 7pm</w:t>
-      </w:r>
-    </w:p>
-    <w:p>
-      <w:pPr>
-        <w:pStyle w:val="NormalWeb"/>
-        <w:spacing w:before="0" w:beforeAutospacing="0" w:after="264" w:afterAutospacing="0"/>
-        <w:rPr>
-          <w:rFonts w:asciiTheme="minorHAnsi" w:hAnsiTheme="minorHAnsi" w:cstheme="minorHAnsi"/>
-          <w:color w:val="000000" w:themeColor="text1"/>
-        </w:rPr>
-      </w:pPr>
-      <w:r>
-        <w:rPr>
-          <w:rFonts w:asciiTheme="minorHAnsi" w:hAnsiTheme="minorHAnsi" w:cstheme="minorHAnsi"/>
-          <w:color w:val="000000" w:themeColor="text1"/>
-        </w:rPr>
-        <w:t>5.12.24 7pm</w:t>
-      </w:r>
-    </w:p>
-    <w:p>
-      <w:pPr>
-        <w:pStyle w:val="NormalWeb"/>
-        <w:spacing w:before="0" w:beforeAutospacing="0" w:after="264" w:afterAutospacing="0"/>
-        <w:rPr>
-          <w:rFonts w:asciiTheme="minorHAnsi" w:hAnsiTheme="minorHAnsi" w:cstheme="minorHAnsi"/>
-          <w:color w:val="000000" w:themeColor="text1"/>
-        </w:rPr>
-      </w:pPr>
-      <w:r>
-        <w:rPr>
-          <w:rFonts w:asciiTheme="minorHAnsi" w:hAnsiTheme="minorHAnsi" w:cstheme="minorHAnsi"/>
-          <w:color w:val="000000" w:themeColor="text1"/>
-        </w:rPr>
-        <w:t>6.12.24 7pm</w:t>
-      </w:r>
-    </w:p>
-    <w:p>
-      <w:pPr>
-        <w:pStyle w:val="NormalWeb"/>
-        <w:spacing w:before="0" w:beforeAutospacing="0" w:after="264" w:afterAutospacing="0"/>
-        <w:rPr>
-          <w:rFonts w:asciiTheme="minorHAnsi" w:hAnsiTheme="minorHAnsi" w:cstheme="minorHAnsi"/>
-          <w:color w:val="000000" w:themeColor="text1"/>
-        </w:rPr>
-      </w:pPr>
-      <w:r>
-        <w:rPr>
-          <w:rFonts w:asciiTheme="minorHAnsi" w:hAnsiTheme="minorHAnsi" w:cstheme="minorHAnsi"/>
-          <w:color w:val="000000" w:themeColor="text1"/>
-        </w:rPr>
-        <w:t>7.12.24 2pm</w:t>
-      </w:r>
-    </w:p>
-    <w:p>
-      <w:pPr>
-        <w:pStyle w:val="NormalWeb"/>
-        <w:spacing w:before="0" w:beforeAutospacing="0" w:after="264" w:afterAutospacing="0"/>
-        <w:rPr>
-          <w:rFonts w:asciiTheme="minorHAnsi" w:hAnsiTheme="minorHAnsi" w:cstheme="minorHAnsi"/>
-          <w:color w:val="000000" w:themeColor="text1"/>
-        </w:rPr>
-      </w:pPr>
-      <w:r>
-        <w:rPr>
-          <w:rFonts w:asciiTheme="minorHAnsi" w:hAnsiTheme="minorHAnsi" w:cstheme="minorHAnsi"/>
-          <w:color w:val="000000" w:themeColor="text1"/>
-        </w:rPr>
-        <w:t>9.12.24 7pm</w:t>
-      </w:r>
-    </w:p>
-    <w:p>
-      <w:pPr>
-        <w:pStyle w:val="NormalWeb"/>
-        <w:spacing w:before="0" w:beforeAutospacing="0" w:after="264" w:afterAutospacing="0"/>
-        <w:rPr>
-          <w:rFonts w:asciiTheme="minorHAnsi" w:hAnsiTheme="minorHAnsi" w:cstheme="minorHAnsi"/>
-          <w:color w:val="000000" w:themeColor="text1"/>
-        </w:rPr>
-      </w:pPr>
-      <w:r>
-        <w:rPr>
-          <w:rFonts w:asciiTheme="minorHAnsi" w:hAnsiTheme="minorHAnsi" w:cstheme="minorHAnsi"/>
-          <w:color w:val="000000" w:themeColor="text1"/>
-        </w:rPr>
-        <w:t>10.12.24 7pm</w:t>
-      </w:r>
-    </w:p>
-    <w:p>
-      <w:pPr>
-        <w:pStyle w:val="NormalWeb"/>
-        <w:spacing w:before="0" w:beforeAutospacing="0" w:after="264" w:afterAutospacing="0"/>
-        <w:rPr>
-          <w:rFonts w:asciiTheme="minorHAnsi" w:hAnsiTheme="minorHAnsi" w:cstheme="minorHAnsi"/>
-          <w:color w:val="000000" w:themeColor="text1"/>
-        </w:rPr>
-      </w:pPr>
-      <w:r>
-        <w:rPr>
-          <w:rFonts w:asciiTheme="minorHAnsi" w:hAnsiTheme="minorHAnsi" w:cstheme="minorHAnsi"/>
-          <w:color w:val="000000" w:themeColor="text1"/>
-        </w:rPr>
-        <w:t xml:space="preserve">11.12.24 7pm </w:t>
-      </w:r>
-    </w:p>
-    <w:p>
-      <w:pPr>
-        <w:pStyle w:val="NormalWeb"/>
-        <w:spacing w:before="0" w:beforeAutospacing="0" w:after="264" w:afterAutospacing="0"/>
-        <w:rPr>
-          <w:rFonts w:asciiTheme="minorHAnsi" w:hAnsiTheme="minorHAnsi" w:cstheme="minorHAnsi"/>
-          <w:color w:val="000000" w:themeColor="text1"/>
-        </w:rPr>
-      </w:pPr>
-      <w:r>
-        <w:rPr>
-          <w:rFonts w:asciiTheme="minorHAnsi" w:hAnsiTheme="minorHAnsi" w:cstheme="minorHAnsi"/>
-          <w:color w:val="000000" w:themeColor="text1"/>
-        </w:rPr>
-        <w:t>12.12.24 7pm</w:t>
+        <w:t xml:space="preserve">0 per person and as shop (£10 deposit per person) </w:t>
+      </w:r>
+    </w:p>
+    <w:p>
+      <w:r>
+        <w:t>Dates are Monday 30</w:t>
+      </w:r>
+      <w:r>
+        <w:rPr>
+          <w:vertAlign w:val="superscript"/>
+        </w:rPr>
+        <w:t>th</w:t>
+      </w:r>
+      <w:r>
+        <w:t xml:space="preserve"> </w:t>
+      </w:r>
+      <w:proofErr w:type="spellStart"/>
+      <w:r>
+        <w:t>nov</w:t>
+      </w:r>
+      <w:proofErr w:type="spellEnd"/>
+      <w:r>
+        <w:t xml:space="preserve"> 7pm and Wednesday 2</w:t>
+      </w:r>
+      <w:r>
+        <w:rPr>
+          <w:vertAlign w:val="superscript"/>
+        </w:rPr>
+        <w:t>nd</w:t>
+      </w:r>
+      <w:r>
+        <w:t xml:space="preserve"> dec 7pm </w:t>
       </w:r>
     </w:p>
     <w:p>
@@ -3267,32 +3109,6 @@
       </w:pPr>
     </w:p>
     <w:p>
-      <w:pPr>
-        <w:rPr>
-          <w:rFonts w:cstheme="minorHAnsi"/>
-        </w:rPr>
-      </w:pPr>
-      <w:r>
-        <w:rPr>
-          <w:rFonts w:cstheme="minorHAnsi"/>
-        </w:rPr>
-        <w:t>Classes Coming Soon – Dates to follow January 202</w:t>
-      </w:r>
-      <w:r>
-        <w:rPr>
-          <w:rFonts w:cstheme="minorHAnsi"/>
-        </w:rPr>
-        <w:t>5</w:t>
-      </w:r>
-    </w:p>
-    <w:p>
-      <w:pPr>
-        <w:rPr>
-          <w:rFonts w:cstheme="minorHAnsi"/>
-        </w:rPr>
-      </w:pPr>
-    </w:p>
-    <w:p>
       <w:r>
         <w:t>Hand Tied Bouquet Class –</w:t>
       </w:r>
@@ -3585,7 +3401,6 @@
         <w:rPr>
           <w:rFonts w:cstheme="minorHAnsi"/>
         </w:rPr>
-        <w:lastRenderedPageBreak/>
         <w:t>CB24 9JD</w:t>
       </w:r>
     </w:p>
@@ -3890,6 +3705,7 @@
         <w:rPr>
           <w:rFonts w:cstheme="minorHAnsi"/>
         </w:rPr>
+        <w:lastRenderedPageBreak/>
         <w:t xml:space="preserve">Value £40 – increasing in £5 increments up to £100 </w:t>
       </w:r>
     </w:p>
@@ -4037,326 +3853,326 @@
         <w:rPr>
           <w:rFonts w:cstheme="minorHAnsi"/>
         </w:rPr>
+        <w:t xml:space="preserve">C </w:t>
+      </w:r>
+    </w:p>
+    <w:p>
+      <w:pPr>
+        <w:rPr>
+          <w:rFonts w:cstheme="minorHAnsi"/>
+        </w:rPr>
+      </w:pPr>
+    </w:p>
+    <w:p>
+      <w:pPr>
+        <w:rPr>
+          <w:rFonts w:cstheme="minorHAnsi"/>
+        </w:rPr>
+      </w:pPr>
+      <w:r>
+        <w:rPr>
+          <w:rFonts w:cstheme="minorHAnsi"/>
+        </w:rPr>
+        <w:t>Plant Lovers Gift Set</w:t>
+      </w:r>
+    </w:p>
+    <w:p>
+      <w:pPr>
+        <w:rPr>
+          <w:rFonts w:cstheme="minorHAnsi"/>
+        </w:rPr>
+      </w:pPr>
+    </w:p>
+    <w:p>
+      <w:pPr>
+        <w:rPr>
+          <w:rFonts w:cstheme="minorHAnsi"/>
+        </w:rPr>
+      </w:pPr>
+      <w:r>
+        <w:rPr>
+          <w:rFonts w:cstheme="minorHAnsi"/>
+        </w:rPr>
+        <w:t xml:space="preserve">Our plant lovers gift set included a potted house plant, a spray mister, a tin candle and a box of confectionary, starting from £45. These items may vary. </w:t>
+      </w:r>
+    </w:p>
+    <w:p>
+      <w:pPr>
+        <w:rPr>
+          <w:rFonts w:cstheme="minorHAnsi"/>
+        </w:rPr>
+      </w:pPr>
+    </w:p>
+    <w:p>
+      <w:pPr>
+        <w:rPr>
+          <w:rFonts w:cstheme="minorHAnsi"/>
+        </w:rPr>
+      </w:pPr>
+      <w:r>
+        <w:rPr>
+          <w:rFonts w:cstheme="minorHAnsi"/>
+        </w:rPr>
+        <w:t xml:space="preserve">Value £45 – increasing in £5 increments up to £100 </w:t>
+      </w:r>
+    </w:p>
+    <w:p>
+      <w:pPr>
+        <w:rPr>
+          <w:rFonts w:cstheme="minorHAnsi"/>
+        </w:rPr>
+      </w:pPr>
+    </w:p>
+    <w:p>
+      <w:pPr>
+        <w:rPr>
+          <w:rFonts w:cstheme="minorHAnsi"/>
+        </w:rPr>
+      </w:pPr>
+      <w:r>
+        <w:rPr>
+          <w:rFonts w:cstheme="minorHAnsi"/>
+        </w:rPr>
+        <w:t xml:space="preserve">Delivery Options – Collection from the shop or Delivery </w:t>
+      </w:r>
+    </w:p>
+    <w:p>
+      <w:pPr>
+        <w:rPr>
+          <w:rFonts w:cstheme="minorHAnsi"/>
+        </w:rPr>
+      </w:pPr>
+    </w:p>
+    <w:p>
+      <w:pPr>
+        <w:rPr>
+          <w:rFonts w:cstheme="minorHAnsi"/>
+        </w:rPr>
+      </w:pPr>
+      <w:r>
+        <w:rPr>
+          <w:rFonts w:cstheme="minorHAnsi"/>
+        </w:rPr>
+        <w:t xml:space="preserve">Name of recipient </w:t>
+      </w:r>
+    </w:p>
+    <w:p>
+      <w:pPr>
+        <w:rPr>
+          <w:rFonts w:cstheme="minorHAnsi"/>
+        </w:rPr>
+      </w:pPr>
+    </w:p>
+    <w:p>
+      <w:pPr>
+        <w:rPr>
+          <w:rFonts w:cstheme="minorHAnsi"/>
+        </w:rPr>
+      </w:pPr>
+      <w:r>
+        <w:rPr>
+          <w:rFonts w:cstheme="minorHAnsi"/>
+        </w:rPr>
+        <w:t xml:space="preserve">Recipient address </w:t>
+      </w:r>
+    </w:p>
+    <w:p>
+      <w:pPr>
+        <w:rPr>
+          <w:rFonts w:cstheme="minorHAnsi"/>
+        </w:rPr>
+      </w:pPr>
+    </w:p>
+    <w:p>
+      <w:pPr>
+        <w:rPr>
+          <w:rFonts w:cstheme="minorHAnsi"/>
+        </w:rPr>
+      </w:pPr>
+      <w:r>
+        <w:rPr>
+          <w:rFonts w:cstheme="minorHAnsi"/>
+        </w:rPr>
+        <w:t xml:space="preserve">Option for card message </w:t>
+      </w:r>
+    </w:p>
+    <w:p>
+      <w:pPr>
+        <w:rPr>
+          <w:rFonts w:cstheme="minorHAnsi"/>
+        </w:rPr>
+      </w:pPr>
+    </w:p>
+    <w:p>
+      <w:pPr>
+        <w:rPr>
+          <w:rFonts w:cstheme="minorHAnsi"/>
+        </w:rPr>
+      </w:pPr>
+      <w:r>
+        <w:rPr>
+          <w:rFonts w:cstheme="minorHAnsi"/>
+        </w:rPr>
+        <w:t xml:space="preserve">Preferred delivery date </w:t>
+      </w:r>
+    </w:p>
+    <w:p>
+      <w:pPr>
+        <w:rPr>
+          <w:rFonts w:cstheme="minorHAnsi"/>
+        </w:rPr>
+      </w:pPr>
+    </w:p>
+    <w:p>
+      <w:pPr>
+        <w:rPr>
+          <w:rFonts w:cstheme="minorHAnsi"/>
+        </w:rPr>
+      </w:pPr>
+    </w:p>
+    <w:p>
+      <w:pPr>
+        <w:rPr>
+          <w:rFonts w:cstheme="minorHAnsi"/>
+        </w:rPr>
+      </w:pPr>
+      <w:r>
+        <w:rPr>
+          <w:rFonts w:cstheme="minorHAnsi"/>
+        </w:rPr>
+        <w:t>D</w:t>
+      </w:r>
+    </w:p>
+    <w:p>
+      <w:pPr>
+        <w:rPr>
+          <w:rFonts w:cstheme="minorHAnsi"/>
+        </w:rPr>
+      </w:pPr>
+    </w:p>
+    <w:p>
+      <w:pPr>
+        <w:rPr>
+          <w:rFonts w:cstheme="minorHAnsi"/>
+        </w:rPr>
+      </w:pPr>
+      <w:r>
+        <w:rPr>
+          <w:rFonts w:cstheme="minorHAnsi"/>
+        </w:rPr>
+        <w:t xml:space="preserve">Basket </w:t>
+      </w:r>
+    </w:p>
+    <w:p>
+      <w:pPr>
+        <w:rPr>
+          <w:rFonts w:cstheme="minorHAnsi"/>
+        </w:rPr>
+      </w:pPr>
+    </w:p>
+    <w:p>
+      <w:pPr>
+        <w:rPr>
+          <w:rFonts w:cstheme="minorHAnsi"/>
+        </w:rPr>
+      </w:pPr>
+      <w:r>
+        <w:rPr>
+          <w:rFonts w:cstheme="minorHAnsi"/>
+        </w:rPr>
+        <w:t xml:space="preserve">Before you go </w:t>
+      </w:r>
+    </w:p>
+    <w:p>
+      <w:pPr>
+        <w:rPr>
+          <w:rFonts w:cstheme="minorHAnsi"/>
+        </w:rPr>
+      </w:pPr>
+    </w:p>
+    <w:p>
+      <w:pPr>
+        <w:rPr>
+          <w:rFonts w:cstheme="minorHAnsi"/>
+        </w:rPr>
+      </w:pPr>
+      <w:r>
+        <w:rPr>
+          <w:rFonts w:cstheme="minorHAnsi"/>
+        </w:rPr>
+        <w:t xml:space="preserve">Would you like to add on a gift or card? </w:t>
+      </w:r>
+    </w:p>
+    <w:p>
+      <w:pPr>
+        <w:rPr>
+          <w:rFonts w:cstheme="minorHAnsi"/>
+        </w:rPr>
+      </w:pPr>
+      <w:r>
+        <w:rPr>
+          <w:rFonts w:cstheme="minorHAnsi"/>
+        </w:rPr>
+        <w:t>Gift cards</w:t>
+      </w:r>
+    </w:p>
+    <w:p>
+      <w:pPr>
+        <w:rPr>
+          <w:rFonts w:cstheme="minorHAnsi"/>
+        </w:rPr>
+      </w:pPr>
+    </w:p>
+    <w:p>
+      <w:pPr>
+        <w:rPr>
+          <w:rFonts w:cstheme="minorHAnsi"/>
+        </w:rPr>
+      </w:pPr>
+      <w:r>
+        <w:rPr>
+          <w:rFonts w:cstheme="minorHAnsi"/>
+        </w:rPr>
+        <w:t>Birthday cards</w:t>
+      </w:r>
+    </w:p>
+    <w:p>
+      <w:pPr>
+        <w:rPr>
+          <w:rFonts w:cstheme="minorHAnsi"/>
+        </w:rPr>
+      </w:pPr>
+      <w:r>
+        <w:rPr>
+          <w:rFonts w:cstheme="minorHAnsi"/>
+        </w:rPr>
+        <w:t>Anniversary card</w:t>
+      </w:r>
+    </w:p>
+    <w:p>
+      <w:pPr>
+        <w:rPr>
+          <w:rFonts w:cstheme="minorHAnsi"/>
+        </w:rPr>
+      </w:pPr>
+      <w:r>
+        <w:rPr>
+          <w:rFonts w:cstheme="minorHAnsi"/>
+        </w:rPr>
+        <w:t>New baby card</w:t>
+      </w:r>
+    </w:p>
+    <w:p>
+      <w:pPr>
+        <w:rPr>
+          <w:rFonts w:cstheme="minorHAnsi"/>
+        </w:rPr>
+      </w:pPr>
+      <w:r>
+        <w:rPr>
+          <w:rFonts w:cstheme="minorHAnsi"/>
+        </w:rPr>
         <w:lastRenderedPageBreak/>
-        <w:t xml:space="preserve">C </w:t>
-      </w:r>
-    </w:p>
-    <w:p>
-      <w:pPr>
-        <w:rPr>
-          <w:rFonts w:cstheme="minorHAnsi"/>
-        </w:rPr>
-      </w:pPr>
-    </w:p>
-    <w:p>
-      <w:pPr>
-        <w:rPr>
-          <w:rFonts w:cstheme="minorHAnsi"/>
-        </w:rPr>
-      </w:pPr>
-      <w:r>
-        <w:rPr>
-          <w:rFonts w:cstheme="minorHAnsi"/>
-        </w:rPr>
-        <w:t>Plant Lovers Gift Set</w:t>
-      </w:r>
-    </w:p>
-    <w:p>
-      <w:pPr>
-        <w:rPr>
-          <w:rFonts w:cstheme="minorHAnsi"/>
-        </w:rPr>
-      </w:pPr>
-    </w:p>
-    <w:p>
-      <w:pPr>
-        <w:rPr>
-          <w:rFonts w:cstheme="minorHAnsi"/>
-        </w:rPr>
-      </w:pPr>
-      <w:r>
-        <w:rPr>
-          <w:rFonts w:cstheme="minorHAnsi"/>
-        </w:rPr>
-        <w:t xml:space="preserve">Our plant lovers gift set included a potted house plant, a spray mister, a tin candle and a box of confectionary, starting from £45. These items may vary. </w:t>
-      </w:r>
-    </w:p>
-    <w:p>
-      <w:pPr>
-        <w:rPr>
-          <w:rFonts w:cstheme="minorHAnsi"/>
-        </w:rPr>
-      </w:pPr>
-    </w:p>
-    <w:p>
-      <w:pPr>
-        <w:rPr>
-          <w:rFonts w:cstheme="minorHAnsi"/>
-        </w:rPr>
-      </w:pPr>
-      <w:r>
-        <w:rPr>
-          <w:rFonts w:cstheme="minorHAnsi"/>
-        </w:rPr>
-        <w:t xml:space="preserve">Value £45 – increasing in £5 increments up to £100 </w:t>
-      </w:r>
-    </w:p>
-    <w:p>
-      <w:pPr>
-        <w:rPr>
-          <w:rFonts w:cstheme="minorHAnsi"/>
-        </w:rPr>
-      </w:pPr>
-    </w:p>
-    <w:p>
-      <w:pPr>
-        <w:rPr>
-          <w:rFonts w:cstheme="minorHAnsi"/>
-        </w:rPr>
-      </w:pPr>
-      <w:r>
-        <w:rPr>
-          <w:rFonts w:cstheme="minorHAnsi"/>
-        </w:rPr>
-        <w:t xml:space="preserve">Delivery Options – Collection from the shop or Delivery </w:t>
-      </w:r>
-    </w:p>
-    <w:p>
-      <w:pPr>
-        <w:rPr>
-          <w:rFonts w:cstheme="minorHAnsi"/>
-        </w:rPr>
-      </w:pPr>
-    </w:p>
-    <w:p>
-      <w:pPr>
-        <w:rPr>
-          <w:rFonts w:cstheme="minorHAnsi"/>
-        </w:rPr>
-      </w:pPr>
-      <w:r>
-        <w:rPr>
-          <w:rFonts w:cstheme="minorHAnsi"/>
-        </w:rPr>
-        <w:t xml:space="preserve">Name of recipient </w:t>
-      </w:r>
-    </w:p>
-    <w:p>
-      <w:pPr>
-        <w:rPr>
-          <w:rFonts w:cstheme="minorHAnsi"/>
-        </w:rPr>
-      </w:pPr>
-    </w:p>
-    <w:p>
-      <w:pPr>
-        <w:rPr>
-          <w:rFonts w:cstheme="minorHAnsi"/>
-        </w:rPr>
-      </w:pPr>
-      <w:r>
-        <w:rPr>
-          <w:rFonts w:cstheme="minorHAnsi"/>
-        </w:rPr>
-        <w:t xml:space="preserve">Recipient address </w:t>
-      </w:r>
-    </w:p>
-    <w:p>
-      <w:pPr>
-        <w:rPr>
-          <w:rFonts w:cstheme="minorHAnsi"/>
-        </w:rPr>
-      </w:pPr>
-    </w:p>
-    <w:p>
-      <w:pPr>
-        <w:rPr>
-          <w:rFonts w:cstheme="minorHAnsi"/>
-        </w:rPr>
-      </w:pPr>
-      <w:r>
-        <w:rPr>
-          <w:rFonts w:cstheme="minorHAnsi"/>
-        </w:rPr>
-        <w:t xml:space="preserve">Option for card message </w:t>
-      </w:r>
-    </w:p>
-    <w:p>
-      <w:pPr>
-        <w:rPr>
-          <w:rFonts w:cstheme="minorHAnsi"/>
-        </w:rPr>
-      </w:pPr>
-    </w:p>
-    <w:p>
-      <w:pPr>
-        <w:rPr>
-          <w:rFonts w:cstheme="minorHAnsi"/>
-        </w:rPr>
-      </w:pPr>
-      <w:r>
-        <w:rPr>
-          <w:rFonts w:cstheme="minorHAnsi"/>
-        </w:rPr>
-        <w:t xml:space="preserve">Preferred delivery date </w:t>
-      </w:r>
-    </w:p>
-    <w:p>
-      <w:pPr>
-        <w:rPr>
-          <w:rFonts w:cstheme="minorHAnsi"/>
-        </w:rPr>
-      </w:pPr>
-    </w:p>
-    <w:p>
-      <w:pPr>
-        <w:rPr>
-          <w:rFonts w:cstheme="minorHAnsi"/>
-        </w:rPr>
-      </w:pPr>
-    </w:p>
-    <w:p>
-      <w:pPr>
-        <w:rPr>
-          <w:rFonts w:cstheme="minorHAnsi"/>
-        </w:rPr>
-      </w:pPr>
-      <w:r>
-        <w:rPr>
-          <w:rFonts w:cstheme="minorHAnsi"/>
-        </w:rPr>
-        <w:t>D</w:t>
-      </w:r>
-    </w:p>
-    <w:p>
-      <w:pPr>
-        <w:rPr>
-          <w:rFonts w:cstheme="minorHAnsi"/>
-        </w:rPr>
-      </w:pPr>
-    </w:p>
-    <w:p>
-      <w:pPr>
-        <w:rPr>
-          <w:rFonts w:cstheme="minorHAnsi"/>
-        </w:rPr>
-      </w:pPr>
-      <w:r>
-        <w:rPr>
-          <w:rFonts w:cstheme="minorHAnsi"/>
-        </w:rPr>
-        <w:t xml:space="preserve">Basket </w:t>
-      </w:r>
-    </w:p>
-    <w:p>
-      <w:pPr>
-        <w:rPr>
-          <w:rFonts w:cstheme="minorHAnsi"/>
-        </w:rPr>
-      </w:pPr>
-    </w:p>
-    <w:p>
-      <w:pPr>
-        <w:rPr>
-          <w:rFonts w:cstheme="minorHAnsi"/>
-        </w:rPr>
-      </w:pPr>
-      <w:r>
-        <w:rPr>
-          <w:rFonts w:cstheme="minorHAnsi"/>
-        </w:rPr>
-        <w:t xml:space="preserve">Before you go </w:t>
-      </w:r>
-    </w:p>
-    <w:p>
-      <w:pPr>
-        <w:rPr>
-          <w:rFonts w:cstheme="minorHAnsi"/>
-        </w:rPr>
-      </w:pPr>
-    </w:p>
-    <w:p>
-      <w:pPr>
-        <w:rPr>
-          <w:rFonts w:cstheme="minorHAnsi"/>
-        </w:rPr>
-      </w:pPr>
-      <w:r>
-        <w:rPr>
-          <w:rFonts w:cstheme="minorHAnsi"/>
-        </w:rPr>
-        <w:t xml:space="preserve">Would you like to add on a gift or card? </w:t>
-      </w:r>
-    </w:p>
-    <w:p>
-      <w:pPr>
-        <w:rPr>
-          <w:rFonts w:cstheme="minorHAnsi"/>
-        </w:rPr>
-      </w:pPr>
-      <w:r>
-        <w:rPr>
-          <w:rFonts w:cstheme="minorHAnsi"/>
-        </w:rPr>
-        <w:t>Gift cards</w:t>
-      </w:r>
-    </w:p>
-    <w:p>
-      <w:pPr>
-        <w:rPr>
-          <w:rFonts w:cstheme="minorHAnsi"/>
-        </w:rPr>
-      </w:pPr>
-    </w:p>
-    <w:p>
-      <w:pPr>
-        <w:rPr>
-          <w:rFonts w:cstheme="minorHAnsi"/>
-        </w:rPr>
-      </w:pPr>
-      <w:r>
-        <w:rPr>
-          <w:rFonts w:cstheme="minorHAnsi"/>
-        </w:rPr>
-        <w:t>Birthday cards</w:t>
-      </w:r>
-    </w:p>
-    <w:p>
-      <w:pPr>
-        <w:rPr>
-          <w:rFonts w:cstheme="minorHAnsi"/>
-        </w:rPr>
-      </w:pPr>
-      <w:r>
-        <w:rPr>
-          <w:rFonts w:cstheme="minorHAnsi"/>
-        </w:rPr>
-        <w:t>Anniversary card</w:t>
-      </w:r>
-    </w:p>
-    <w:p>
-      <w:pPr>
-        <w:rPr>
-          <w:rFonts w:cstheme="minorHAnsi"/>
-        </w:rPr>
-      </w:pPr>
-      <w:r>
-        <w:rPr>
-          <w:rFonts w:cstheme="minorHAnsi"/>
-        </w:rPr>
-        <w:t>New baby card</w:t>
-      </w:r>
-    </w:p>
-    <w:p>
-      <w:pPr>
-        <w:rPr>
-          <w:rFonts w:cstheme="minorHAnsi"/>
-        </w:rPr>
-      </w:pPr>
-      <w:r>
-        <w:rPr>
-          <w:rFonts w:cstheme="minorHAnsi"/>
-        </w:rPr>
         <w:t>New home card</w:t>
       </w:r>
     </w:p>
@@ -4597,7 +4413,7 @@
 </file>
 
 <file path=word/numbering.xml><?xml version="1.0" encoding="utf-8"?>
-<w:numbering xmlns:wpc="http://schemas.microsoft.com/office/word/2010/wordprocessingCanvas" xmlns:cx="http://schemas.microsoft.com/office/drawing/2014/chartex" xmlns:cx1="http://schemas.microsoft.com/office/drawing/2015/9/8/chartex" xmlns:cx2="http://schemas.microsoft.com/office/drawing/2015/10/21/chartex" xmlns:cx3="http://schemas.microsoft.com/office/drawing/2016/5/9/chartex" xmlns:cx4="http://schemas.microsoft.com/office/drawing/2016/5/10/chartex" xmlns:cx5="http://schemas.microsoft.com/office/drawing/2016/5/11/chartex" xmlns:cx6="http://schemas.microsoft.com/office/drawing/2016/5/12/chartex" xmlns:cx7="http://schemas.microsoft.com/office/drawing/2016/5/13/chartex" xmlns:cx8="http://schemas.microsoft.com/office/drawing/2016/5/14/chartex" xmlns:mc="http://schemas.openxmlformats.org/markup-compatibility/2006" xmlns:aink="http://schemas.microsoft.com/office/drawing/2016/ink" xmlns:am3d="http://schemas.microsoft.com/office/drawing/2017/model3d" xmlns:o="urn:schemas-microsoft-com:office:office" xmlns:oel="http://schemas.microsoft.com/office/2019/extlst" xmlns:r="http://schemas.openxmlformats.org/officeDocument/2006/relationships" xmlns:m="http://schemas.openxmlformats.org/officeDocument/2006/math" xmlns:v="urn:schemas-microsoft-com:vml" xmlns:wp14="http://schemas.microsoft.com/office/word/2010/wordprocessingDrawing" xmlns:wp="http://schemas.openxmlformats.org/drawingml/2006/wordprocessingDrawing" xmlns:w10="urn:schemas-microsoft-com:office:word" xmlns:w="http://schemas.openxmlformats.org/wordprocessingml/2006/main" xmlns:w14="http://schemas.microsoft.com/office/word/2010/wordml" xmlns:w15="http://schemas.microsoft.com/office/word/2012/wordml" xmlns:w16cex="http://schemas.microsoft.com/office/word/2018/wordml/cex" xmlns:w16cid="http://schemas.microsoft.com/office/word/2016/wordml/cid" xmlns:w16="http://schemas.microsoft.com/office/word/2018/wordml" xmlns:w16du="http://schemas.microsoft.com/office/word/2023/wordml/word16du" xmlns:w16sdtdh="http://schemas.microsoft.com/office/word/2020/wordml/sdtdatahash" xmlns:w16sdtfl="http://schemas.microsoft.com/office/word/2024/wordml/sdtformatlock" xmlns:w16se="http://schemas.microsoft.com/office/word/2015/wordml/symex" xmlns:wpg="http://schemas.microsoft.com/office/word/2010/wordprocessingGroup" xmlns:wpi="http://schemas.microsoft.com/office/word/2010/wordprocessingInk" xmlns:wne="http://schemas.microsoft.com/office/word/2006/wordml" xmlns:wps="http://schemas.microsoft.com/office/word/2010/wordprocessingShape" mc:Ignorable="w14 w15 w16se w16cid w16 w16cex w16sdtdh w16sdtfl w16du wp14">
+<w:numbering xmlns:wpc="http://schemas.microsoft.com/office/word/2010/wordprocessingCanvas" xmlns:cx="http://schemas.microsoft.com/office/drawing/2014/chartex" xmlns:cx1="http://schemas.microsoft.com/office/drawing/2015/9/8/chartex" xmlns:cx2="http://schemas.microsoft.com/office/drawing/2015/10/21/chartex" xmlns:cx3="http://schemas.microsoft.com/office/drawing/2016/5/9/chartex" xmlns:cx4="http://schemas.microsoft.com/office/drawing/2016/5/10/chartex" xmlns:cx5="http://schemas.microsoft.com/office/drawing/2016/5/11/chartex" xmlns:cx6="http://schemas.microsoft.com/office/drawing/2016/5/12/chartex" xmlns:cx7="http://schemas.microsoft.com/office/drawing/2016/5/13/chartex" xmlns:cx8="http://schemas.microsoft.com/office/drawing/2016/5/14/chartex" xmlns:mc="http://schemas.openxmlformats.org/markup-compatibility/2006" xmlns:m="http://schemas.openxmlformats.org/officeDocument/2006/math" xmlns:aink="http://schemas.microsoft.com/office/drawing/2016/ink" xmlns:am3d="http://schemas.microsoft.com/office/drawing/2017/model3d" xmlns:oel="http://schemas.microsoft.com/office/2019/extlst" xmlns:r="http://schemas.openxmlformats.org/officeDocument/2006/relationships" xmlns:wp14="http://schemas.microsoft.com/office/word/2010/wordprocessingDrawing" xmlns:wp="http://schemas.openxmlformats.org/drawingml/2006/wordprocessingDrawing" xmlns:wpg="http://schemas.microsoft.com/office/word/2010/wordprocessingGroup" xmlns:wpi="http://schemas.microsoft.com/office/word/2010/wordprocessingInk" xmlns:wps="http://schemas.microsoft.com/office/word/2010/wordprocessingShape" xmlns:o="urn:schemas-microsoft-com:office:office" xmlns:v="urn:schemas-microsoft-com:vml" xmlns:w10="urn:schemas-microsoft-com:office:word" xmlns:w="http://schemas.openxmlformats.org/wordprocessingml/2006/main" xmlns:w14="http://schemas.microsoft.com/office/word/2010/wordml" xmlns:w15="http://schemas.microsoft.com/office/word/2012/wordml" xmlns:w16cex="http://schemas.microsoft.com/office/word/2018/wordml/cex" xmlns:w16cid="http://schemas.microsoft.com/office/word/2016/wordml/cid" xmlns:w16="http://schemas.microsoft.com/office/word/2018/wordml" xmlns:w16sdtdh="http://schemas.microsoft.com/office/word/2020/wordml/sdtdatahash" xmlns:w16sdtfl="http://schemas.microsoft.com/office/word/2024/wordml/sdtformatlock" xmlns:w16se="http://schemas.microsoft.com/office/word/2015/wordml/symex" xmlns:w16du="http://schemas.microsoft.com/office/word/2023/wordml/word16du" xmlns:wne="http://schemas.microsoft.com/office/word/2006/wordml" mc:Ignorable="w14 w15 w16se w16cid w16 w16cex w16sdtdh w16sdtfl w16du wp14">
   <w:abstractNum w:abstractNumId="0" w15:restartNumberingAfterBreak="0">
     <w:nsid w:val="1F5960DC"/>
     <w:multiLevelType w:val="hybridMultilevel"/>
@@ -4950,7 +4766,7 @@
 </file>
 
 <file path=word/styles.xml><?xml version="1.0" encoding="utf-8"?>
-<w:styles xmlns:mc="http://schemas.openxmlformats.org/markup-compatibility/2006" xmlns:r="http://schemas.openxmlformats.org/officeDocument/2006/relationships" xmlns:w="http://schemas.openxmlformats.org/wordprocessingml/2006/main" xmlns:w14="http://schemas.microsoft.com/office/word/2010/wordml" xmlns:w15="http://schemas.microsoft.com/office/word/2012/wordml" xmlns:w16cex="http://schemas.microsoft.com/office/word/2018/wordml/cex" xmlns:w16cid="http://schemas.microsoft.com/office/word/2016/wordml/cid" xmlns:w16="http://schemas.microsoft.com/office/word/2018/wordml" xmlns:w16du="http://schemas.microsoft.com/office/word/2023/wordml/word16du" xmlns:w16sdtdh="http://schemas.microsoft.com/office/word/2020/wordml/sdtdatahash" xmlns:w16sdtfl="http://schemas.microsoft.com/office/word/2024/wordml/sdtformatlock" xmlns:w16se="http://schemas.microsoft.com/office/word/2015/wordml/symex" mc:Ignorable="w14 w15 w16se w16cid w16 w16cex w16sdtdh w16sdtfl w16du">
+<w:styles xmlns:mc="http://schemas.openxmlformats.org/markup-compatibility/2006" xmlns:r="http://schemas.openxmlformats.org/officeDocument/2006/relationships" xmlns:w="http://schemas.openxmlformats.org/wordprocessingml/2006/main" xmlns:w14="http://schemas.microsoft.com/office/word/2010/wordml" xmlns:w15="http://schemas.microsoft.com/office/word/2012/wordml" xmlns:w16cex="http://schemas.microsoft.com/office/word/2018/wordml/cex" xmlns:w16cid="http://schemas.microsoft.com/office/word/2016/wordml/cid" xmlns:w16="http://schemas.microsoft.com/office/word/2018/wordml" xmlns:w16sdtdh="http://schemas.microsoft.com/office/word/2020/wordml/sdtdatahash" xmlns:w16sdtfl="http://schemas.microsoft.com/office/word/2024/wordml/sdtformatlock" xmlns:w16se="http://schemas.microsoft.com/office/word/2015/wordml/symex" xmlns:w16du="http://schemas.microsoft.com/office/word/2023/wordml/word16du" mc:Ignorable="w14 w15 w16se w16cid w16 w16cex w16sdtdh w16sdtfl w16du">
   <w:docDefaults>
     <w:rPrDefault>
       <w:rPr>

</xml_diff>